<commit_message>
Paso el documento a nota interna y corrijo las fechas de Ideo Maker
Vicente sigue en Ideo Maker: el documento era una propuesta de afuera y
pasa a ser una nota interna. Cambia la portada, el recuadro de apertura,
y sobre todo la seccion final: ya no dice trabaje ahi entre 2022 y 2025
sino escribo esto desde adentro, y agrega que los proyectos que propone
publicar son suyos, asi que tambien le toca a el escribirlos.

El interes paralelo con su portafolio deja de presentarse como conflicto
y pasa a ser lo que es: la empresa demuestra que el trabajo existe y a
que escala, las personas demuestran quien lo hizo. Un sostenedor quiere
ver las dos cosas y hoy no encuentra ninguna.

Y arrastra una correccion en el sitio, que decia lo mismo mal: la
trayectoria pasa de 2022-2025 a 2022-hoy, y la bio de pasado a
presente.

Queda pendiente que Vicente revise su CV, que tambien dice 2022-2025.

Co-Authored-By: Claude Opus 5 <noreply@anthropic.com>
</commit_message>
<xml_diff>
--- a/documentacion/Ideo-Maker-posicionamiento.docx
+++ b/documentacion/Ideo-Maker-posicionamiento.docx
@@ -15,7 +15,7 @@
           <w:sz w:val="16"/>
           <w:spacing w:val="120"/>
         </w:rPr>
-        <w:t>PARA IDEO MAKER SPA</w:t>
+        <w:t>NOTA INTERNA · IDEO MAKER SPA</w:t>
       </w:r>
     </w:p>
     <w:p>
@@ -102,7 +102,7 @@
                 <w:color w:val="111111"/>
                 <w:sz w:val="20"/>
               </w:rPr>
-              <w:t>Qué es esto y por qué se los mando</w:t>
+              <w:t>Qué es esto</w:t>
             </w:r>
           </w:p>
           <w:p>
@@ -115,7 +115,7 @@
                 <w:color w:val="5A5A5A"/>
                 <w:sz w:val="19"/>
               </w:rPr>
-              <w:t>El 20 de septiembre le hice a ChatGPT, Gemini y Perplexity las preguntas que haría un sostenedor antes de contratar. Sin cuenta, en incógnito, seis preguntas por herramienta. Lo que sigue no es una opinión sobre marketing: es lo que esas herramientas respondieron, más el diagnóstico técnico del sitio de Ideo Maker. Lo comparto porque el resultado me sorprendió y porque tiene arreglo, y no es caro.</w:t>
+              <w:t>El 20 de septiembre le hice a ChatGPT, Gemini y Perplexity las preguntas que haría un sostenedor antes de contratarnos. Sin cuenta, en incógnito, seis preguntas por herramienta. Lo que sigue no es una opinión sobre marketing: es lo que esas herramientas respondieron, más el diagnóstico técnico de nuestro propio sitio. Lo levanto porque el resultado me sorprendió, porque tiene arreglo y porque no cuesta plata, solo trabajo.</w:t>
             </w:r>
           </w:p>
         </w:tc>
@@ -2422,7 +2422,7 @@
           <w:color w:val="111111"/>
           <w:sz w:val="30"/>
         </w:rPr>
-        <w:t>6. Por qué se los mando</w:t>
+        <w:t>6. Por qué levanto esto</w:t>
       </w:r>
     </w:p>
     <w:p>
@@ -2437,7 +2437,7 @@
           <w:color w:val="111111"/>
           <w:sz w:val="20"/>
         </w:rPr>
-        <w:t>Trabajé en Ideo Maker como Director de Investigación, Desarrollo e Innovación entre 2022 y 2025. Buena parte de los proyectos que este documento propone publicar son trabajos en los que participé.</w:t>
+        <w:t>Escribo esto desde adentro, como Director de Investigación, Desarrollo e Innovación. Buena parte de los proyectos que este documento propone publicar son trabajos en los que participé, así que también me toca a mí escribirlos: no estoy pidiendo que otro haga la pega.</w:t>
       </w:r>
     </w:p>
     <w:p>
@@ -2451,7 +2451,7 @@
           <w:color w:val="111111"/>
           <w:sz w:val="20"/>
         </w:rPr>
-        <w:t xml:space="preserve">Y tengo un interés directo, así que lo digo de frente: </w:t>
+        <w:t xml:space="preserve">Y digo de frente que tengo un interés paralelo: </w:t>
       </w:r>
       <w:r>
         <w:rPr>
@@ -2469,7 +2469,7 @@
           <w:color w:val="111111"/>
           <w:sz w:val="20"/>
         </w:rPr>
-        <w:t xml:space="preserve"> En esa misma medición yo aparezco cero de tres, igual que la empresa. Si Ideo Maker documenta su trabajo y yo documento el mío, los dos ganamos, porque cada uno respalda al otro: la empresa demuestra que el trabajo existe, y las personas demuestran quién lo hizo.</w:t>
+        <w:t xml:space="preserve"> En esa misma medición yo aparezco cero de doce, igual que la empresa. No compiten: se refuerzan. La empresa demuestra que el trabajo existe y a qué escala; las personas demuestran quién lo hizo y cómo. Un sostenedor que busca proveedor quiere ver las dos cosas, y hoy no encuentra ninguna.</w:t>
       </w:r>
     </w:p>
     <w:p>
@@ -2587,7 +2587,7 @@
           <w:color w:val="5A5A5A"/>
           <w:sz w:val="16"/>
         </w:rPr>
-        <w:t>Medición del 20 de septiembre de 2026  ·  Diagnóstico de ideomaker.cl del mismo día  ·  Los datos completos están disponibles si los quieren revisar</w:t>
+        <w:t>Medición del 20 de septiembre de 2026  ·  Diagnóstico de ideomaker.cl del mismo día  ·  Tengo los datos completos y el detalle por pregunta, por si alguien los quiere revisar</w:t>
       </w:r>
     </w:p>
     <w:sectPr>

</xml_diff>